<commit_message>
fix(paper): post-review audit of budget follow-up; regenerate guide and report
- audit_budget_truncation.py: finish reasons/cap hits per budget, complete-answers
  sensitivity, Holm within cell and across all 18 follow-up tests
- independent_check.py: 118/118 reported numbers re-derived with statsmodels,
  scikit-learn, Monte Carlo sign-flip and alternative-seed bootstrap
- build_paper.py: "not detected" + intervals instead of equivalence wording;
  1,024-token truncation and exploratory status stated; Holm-18 for English result
- MANUSCRIPT_BUILD_GUIDE.md v2 generated from the same sources as the DOCX
- FULL_REVISION_REPORT.md: Section 20 post-review audit; Part G regenerated
</commit_message>
<xml_diff>
--- a/paper_v2/revised/IndraLLM_IEEE_REVISED.docx
+++ b/paper_v2/revised/IndraLLM_IEEE_REVISED.docx
@@ -156,7 +156,7 @@
         <w:rPr>
           <w:b/>
         </w:rPr>
-        <w:t xml:space="preserve"> (p &lt; 0.001; topic-level p = 0.004). Almost every response hit that cap, and Brahmic-script answers fit half as many characters into it. Re-answering the key conditions with 512 and 1,024 tokens removes the </w:t>
+        <w:t xml:space="preserve"> (p &lt; 0.001; topic-level p = 0.004). Almost every response hit that cap, and Brahmic-script answers fit half as many characters into it. When the key conditions are re-answered with 512 and 1,024 tokens, no </w:t>
       </w:r>
       <w:r>
         <w:rPr>
@@ -182,20 +182,33 @@
         <w:rPr>
           <w:b/>
         </w:rPr>
-        <w:t xml:space="preserve"> gap under both a self-judge (+4 and −3 points; p ≥ 0.57) and a judge from another model family (−6 and −5; p ≥ 0.34). The English–</w:t>
+        <w:t xml:space="preserve"> gap is detected under either a self-judge (+4 and −3 points) or a judge from another model family (−6 and −5); the intervals exclude the 128-token gap, although no equivalence test was pre-specified and 64% of </w:t>
       </w:r>
       <w:r>
         <w:rPr>
           <w:b/>
           <w:smallCaps/>
         </w:rPr>
+        <w:t>mixed</w:t>
+      </w:r>
+      <w:r>
+        <w:rPr>
+          <w:b/>
+        </w:rPr>
+        <w:t xml:space="preserve"> answers still reach the 1,024-token cap. The English–</w:t>
+      </w:r>
+      <w:r>
+        <w:rPr>
+          <w:b/>
+          <w:smallCaps/>
+        </w:rPr>
         <w:t>cs-lat</w:t>
       </w:r>
       <w:r>
         <w:rPr>
           <w:b/>
         </w:rPr>
-        <w:t xml:space="preserve"> gap behaves differently: under the self-judge it grows with the budget, to 24 points at 1,024 tokens (topic-level p = 0.018), while under the second judge it is 4–12 points and never significant. The two judges agree on 75–81% of outputs (κ = 0.47–0.61), and no human validation of either was performed. Measured representation effects are therefore sensitive to the output budget and to the evaluator, and should not be read as effects of representation without checking both. Prompts, outputs, judgements, a gold-answer ledger and code are released.</w:t>
+        <w:t xml:space="preserve"> gap behaves differently: under the self-judge it grows to 24 points at 1,024 tokens (topic-level p = 0.018; 0.29 after correction across all follow-up tests), while under the second judge it is 4–12 points and never significant. The judges agree on 75–81% of outputs (κ = 0.47–0.61), and no human validation of either was performed. Measured representation effects are therefore sensitive to the output budget and to the evaluator, and should not be read as effects of representation without checking both. Prompts, outputs, judgements, a gold-answer ledger and code are released.</w:t>
       </w:r>
     </w:p>
     <w:p>
@@ -1132,7 +1145,7 @@
         <w:t>Contributions.</w:t>
       </w:r>
       <w:r>
-        <w:t xml:space="preserve"> (1) A paired six-condition design for Indic factual QA, with a matched-English control that removes a template confound we found in our first run. (2) A controlled three-budget rerun showing that the 23-point mixed-script penalty measured at 128 tokens disappears at 512 and 1,024 tokens under two judges, while the English–code-switching gap moves in the opposite direction under one judge only. (3) Judge disagreement as a result: harmonising the judge configuration shrinks the English–code-switching gap at 128 tokens from 17 to 11 points, the two judges agree on 75–81% of outputs, and whether the English advantage is significant depends on which judge is used. (4) Inference that treats the 20 topics as the unit of independent evidence, and a release of prompts, outputs, both judges' labels, a gold-answer ledger and evaluation scripts.</w:t>
+        <w:t xml:space="preserve"> (1) A paired six-condition design for Indic factual QA, with a matched-English control that removes a template confound we found in our first run. (2) A controlled three-budget rerun in which the 23-point mixed-script penalty measured at 128 tokens is not detectable at 512 or 1,024 tokens under either of two judges, while the English–code-switching gap moves in the opposite direction under one judge only. (3) Judge disagreement as a result: harmonising the judge configuration shrinks the English–code-switching gap at 128 tokens from 17 to 11 points, the two judges agree on 75–81% of outputs, and whether the English advantage is significant depends on which judge is used. (4) Inference that treats the 20 topics as the unit of independent evidence, and a release of prompts, outputs, both judges' labels, a gold-answer ledger and evaluation scripts.</w:t>
       </w:r>
     </w:p>
     <w:p>
@@ -1146,7 +1159,7 @@
         <w:t>Findings in brief.</w:t>
       </w:r>
       <w:r>
-        <w:t xml:space="preserve"> Evaluating multilingual LLMs across representation conditions is sensitive to the output-token budget and to the choice of evaluator, and observed differences should not automatically be interpreted as representation effects. At 128 tokens, accuracy falls from English to the Indic representations and mixed script is lowest. Almost every response hits that cap and Brahmic-script answers are about half as long in characters; with 512 or 1,024 tokens, </w:t>
+        <w:t xml:space="preserve"> Evaluating multilingual LLMs across representation conditions is sensitive to the output-token budget and to the choice of evaluator, and observed differences should not automatically be interpreted as representation effects. At 128 tokens, accuracy falls from English to the Indic representations and mixed script is lowest. Almost every response hits that cap and Brahmic-script answers are about half as long in characters; with 512 or 1,024 tokens, no </w:t>
       </w:r>
       <w:r>
         <w:rPr>
@@ -1155,7 +1168,7 @@
         <w:t>mixed</w:t>
       </w:r>
       <w:r>
-        <w:t xml:space="preserve"> and </w:t>
+        <w:t>–</w:t>
       </w:r>
       <w:r>
         <w:rPr>
@@ -1164,7 +1177,7 @@
         <w:t>cs-lat</w:t>
       </w:r>
       <w:r>
-        <w:t xml:space="preserve"> do not differ under either judge. The English advantage over Latin-script code-switching is significant at the topic level only under the self-judge at 1,024 tokens; under the cross-family judge it is small at every budget. Neither judge has been validated against human labels, so we report this as judge sensitivity, not as evidence that either judge is right.</w:t>
+        <w:t xml:space="preserve"> difference is detected under either judge, though we do not claim equivalence. The English advantage over Latin-script code-switching is significant at the topic level only under the self-judge at 1,024 tokens, and not after correction across all follow-up tests; under the cross-family judge it is small at every budget. Neither judge has been validated against human labels, so we report this as judge sensitivity, not as evidence that either judge is right.</w:t>
       </w:r>
     </w:p>
     <w:bookmarkEnd w:id="20"/>
@@ -2102,7 +2115,7 @@
         <w:t>en-match</w:t>
       </w:r>
       <w:r>
-        <w:t>, plus the change in each gap between budgets, each under both judges. Everything else is exploratory. All numbers are recomputed from the raw files by the scripts in Appendix E.</w:t>
+        <w:t>, plus the change in each gap between budgets, each under both judges. The 512-token run was planned to test the budget confound; the 1,024-token run was added after its results were seen, so 1,024-token results are exploratory. For the follow-up we report Holm adjustment within each budget–judge cell and across all 18 follow-up tests (3 budgets × 2 judges × 3 contrasts). A non-significant difference is not evidence of equivalence; no equivalence margin was pre-specified, so we report intervals. Everything else is exploratory. All numbers are recomputed from the raw files by the scripts in Appendix E.</w:t>
       </w:r>
     </w:p>
     <w:bookmarkEnd w:id="29"/>
@@ -4862,16 +4875,25 @@
         <w:t>mixed</w:t>
       </w:r>
       <w:r>
-        <w:t xml:space="preserve"> (300 prompts) twice, with 512 and with 1,024-token limits, changing nothing else: same model identifier, system prompt, decoding settings and prompts. Every budget was graded by J-QWEN and by J-OSS, so each comparison across budgets uses one judge (Table III, Fig. 5b). At 1,024 tokens the cap no longer binds for English (95 of 100 responses stop on their own) and binds less for code-switched answers (61 </w:t>
+        <w:t xml:space="preserve"> (300 prompts) twice, with 512 and with 1,024-token limits, changing nothing else: same model identifier, system prompt, decoding settings and prompts. Every budget was graded by J-QWEN and by J-OSS, so each comparison across budgets uses one judge (Table III, Fig. 5b). Even 1,024 tokens is not an unconstrained condition: according to the provider's finish reasons, 5 </w:t>
       </w:r>
       <w:r>
         <w:rPr>
           <w:smallCaps/>
         </w:rPr>
+        <w:t>en-match</w:t>
+      </w:r>
+      <w:r>
+        <w:t xml:space="preserve">, 39 </w:t>
+      </w:r>
+      <w:r>
+        <w:rPr>
+          <w:smallCaps/>
+        </w:rPr>
         <w:t>cs-lat</w:t>
       </w:r>
       <w:r>
-        <w:t xml:space="preserve"> and 36 </w:t>
+        <w:t xml:space="preserve"> and 64 </w:t>
       </w:r>
       <w:r>
         <w:rPr>
@@ -4880,7 +4902,7 @@
         <w:t>mixed</w:t>
       </w:r>
       <w:r>
-        <w:t xml:space="preserve"> responses stop). The </w:t>
+        <w:t xml:space="preserve"> responses still hit the limit (15, 39 and 63 end mid-sentence). The </w:t>
       </w:r>
       <w:r>
         <w:rPr>
@@ -4898,7 +4920,7 @@
         <w:t>cs-lat</w:t>
       </w:r>
       <w:r>
-        <w:t xml:space="preserve"> gap, −23 points at 128 tokens under J-QWEN, is +4 at 512 and −3 at 1,024 (p = 0.57 and 0.70); under J-OSS it is −8, −6 and −5, never significant. Between 128 and 1,024 tokens it narrows by 20 points under J-QWEN (topic-bootstrap CI [5, 34], permutation p = 0.023). On the 60 word-identical propositions the picture is the same (J-QWEN at 1,024 tokens: 65% vs. 60%, p = 0.58). The English–</w:t>
+        <w:t xml:space="preserve"> gap, −23 points at 128 tokens under J-QWEN, is +4 at 512 and −3 at 1,024 (p = 0.57 and 0.70; topic-bootstrap 95% CIs [−8, 15] and [−14, 8]); under J-OSS it is −8, −6 and −5, never significant (CIs at 512 and 1,024 [−18, 6] and [−17, 7]). These intervals exclude the 23-point gap seen at 128 tokens, but they do not establish equivalence. Between 128 and 1,024 tokens the gap narrows by 20 points under J-QWEN (CI [5, 34], permutation p = 0.023). The pattern holds on the 60 word-identical propositions (J-QWEN at 1,024 tokens: 65% vs. 60%, p = 0.58) and, as an exploratory check that may be biased by selecting on completion, on the 29 propositions where both responses finished before the 1,024-token limit (J-QWEN 48% vs. 55%, p = 0.75; J-OSS 55% vs. 52%, p = 1.0). The English–</w:t>
       </w:r>
       <w:r>
         <w:rPr>
@@ -4907,7 +4929,7 @@
         <w:t>cs-lat</w:t>
       </w:r>
       <w:r>
-        <w:t xml:space="preserve"> gap moves the other way under J-QWEN, from −11 at 128 to −21 at 512 and −24 at 1,024 tokens (exact p &lt; 0.001; topic-level p = 0.018, Holm-adjusted 0.036 within the three follow-up contrasts), whereas under J-OSS it is −12, −4 and −7 and not significant at any budget (p ≥ 0.050).</w:t>
+        <w:t xml:space="preserve"> gap moves the other way under J-QWEN, from −11 at 128 to −21 at 512 and −24 at 1,024 tokens (exact p &lt; 0.001; topic-level p = 0.018, Holm-adjusted 0.036 within the three contrasts of that budget and 0.29 across all 18 follow-up tests), whereas under J-OSS it is −12, −4 and −7 and not significant at any budget (p ≥ 0.050). Restricted to the 57 propositions where both responses finished, the same split appears (J-QWEN 79% vs. 61%, p = 0.013; J-OSS 65% vs. 60%, p = 0.55).</w:t>
       </w:r>
     </w:p>
     <w:p>
@@ -6231,7 +6253,7 @@
         <w:t>mixed</w:t>
       </w:r>
       <w:r>
-        <w:t xml:space="preserve"> penalty is not evidence that script alternation harms recall: once the budget allows longer answers, mixed-script and Latin-script code-switched prompts yield similar accuracy under both judges. Its most likely source is that Brahmic-script answers reach the cap before reaching the fact, and answers a human would call incomplete are then graded as wrong; the </w:t>
+        <w:t xml:space="preserve"> penalty is not evidence that script alternation harms recall: once the budget allows longer answers, no difference between mixed-script and Latin-script code-switched prompts is detected under either judge, and the intervals exclude a gap of the 128-token size. Its most likely source is that Brahmic-script answers reach the cap before reaching the fact, and answers a human would call incomplete are then graded as wrong; the </w:t>
       </w:r>
       <w:r>
         <w:rPr>
@@ -6276,7 +6298,25 @@
         <w:t>native</w:t>
       </w:r>
       <w:r>
-        <w:t xml:space="preserve"> one, which also argues against a boundary-density account. Third, the English advantage is unstable: it grows with the budget under one judge and stays small under the other. We cannot tell from these data which judge is closer to a careful human reader, so the instability itself is the finding.</w:t>
+        <w:t xml:space="preserve"> one, which also argues against a boundary-density account. Third, the English advantage is unstable: it grows with the budget under one judge and stays small under the other, and its topic-level significance under the first does not survive correction across the follow-up. We cannot tell from these data which judge is closer to a careful human reader, so the instability itself is the finding. Because most </w:t>
+      </w:r>
+      <w:r>
+        <w:rPr>
+          <w:smallCaps/>
+        </w:rPr>
+        <w:t>mixed</w:t>
+      </w:r>
+      <w:r>
+        <w:t xml:space="preserve"> and many </w:t>
+      </w:r>
+      <w:r>
+        <w:rPr>
+          <w:smallCaps/>
+        </w:rPr>
+        <w:t>cs-lat</w:t>
+      </w:r>
+      <w:r>
+        <w:t xml:space="preserve"> answers still reach the 1,024-token limit, the output budget remains a possible confound for any residual difference.</w:t>
       </w:r>
     </w:p>
     <w:bookmarkEnd w:id="48"/>
@@ -8723,7 +8763,7 @@
         <w:pStyle w:val="FirstParagraph"/>
       </w:pPr>
       <w:r>
-        <w:t>What the data support is narrower than the design promised, and different from what our first run suggested. Evaluating multilingual LLMs across representation conditions is sensitive to the output-token budget and to the choice of evaluator, and observed differences should not automatically be interpreted as representation effects. For this model and these 20 topics, the clearest representation effect at a 128-token budget, the mixed-script penalty, disappears when answers can be longer, under both judges; the English advantage over code-switching appears or disappears with the judge. We do not claim that native script or code-switching damages factual recall, and we make no claim about other models.</w:t>
+        <w:t>What the data support is narrower than the design promised, and different from what our first run suggested. Evaluating multilingual LLMs across representation conditions is sensitive to the output-token budget and to the choice of evaluator, and observed differences should not automatically be interpreted as representation effects. For this model and these 20 topics, the clearest representation effect at a 128-token budget, the mixed-script penalty, is no longer detected when answers can be longer, under either judge; the English advantage over code-switching appears or disappears with the judge. We do not claim that native script or code-switching damages factual recall, and we make no claim about other models.</w:t>
       </w:r>
     </w:p>
     <w:p>
@@ -8892,7 +8932,7 @@
               <w:rPr>
                 <w:sz w:val="16"/>
               </w:rPr>
-              <w:t>Not supported: only at 128 tokens; +4 (512), −3 (1,024), n.s. under both judges</w:t>
+              <w:t>Not supported: only at 128 tokens; +4 (512), −3 (1,024), n.s. under both judges (not an equivalence test)</w:t>
             </w:r>
           </w:p>
         </w:tc>
@@ -8944,7 +8984,7 @@
               <w:rPr>
                 <w:sz w:val="16"/>
               </w:rPr>
-              <w:t>Judge-dependent: topic p = 0.018 at 1,024 tokens (J-QWEN); n.s. at every budget (J-OSS)</w:t>
+              <w:t>Judge-dependent: topic p = 0.018 at 1,024 tokens under J-QWEN (0.29 after Holm over 18 tests); n.s. at every budget under J-OSS</w:t>
             </w:r>
           </w:p>
         </w:tc>
@@ -9277,7 +9317,16 @@
         <w:t>mixed</w:t>
       </w:r>
       <w:r>
-        <w:t xml:space="preserve"> responses still hit the cap; we re-ran three of the six conditions and did not test an instruction fixing the answer language. </w:t>
+        <w:t xml:space="preserve"> responses still hit the cap, so the budget is not fully removed as a confound; the 1,024-token run was added after the 512-token results were seen and is exploratory; we re-ran three of the six conditions and did not test an instruction fixing the answer language. </w:t>
+      </w:r>
+      <w:r>
+        <w:rPr>
+          <w:b/>
+        </w:rPr>
+        <w:t>Equivalence.</w:t>
+      </w:r>
+      <w:r>
+        <w:t xml:space="preserve"> No equivalence margin was pre-specified, so non-significant gaps are reported with intervals, not as equivalence. </w:t>
       </w:r>
       <w:r>
         <w:rPr>

</xml_diff>

<commit_message>
docs(paper): frame budget result as sensitivity finding; soften causal wording
64% of MIXED answers still hit the 1,024-token cap, so the budget comparison is
reported as a sensitivity finding rather than a clean estimate of the script effect.
</commit_message>
<xml_diff>
--- a/paper_v2/revised/IndraLLM_IEEE_REVISED.docx
+++ b/paper_v2/revised/IndraLLM_IEEE_REVISED.docx
@@ -1177,7 +1177,16 @@
         <w:t>cs-lat</w:t>
       </w:r>
       <w:r>
-        <w:t xml:space="preserve"> difference is detected under either judge, though we do not claim equivalence. The English advantage over Latin-script code-switching is significant at the topic level only under the self-judge at 1,024 tokens, and not after correction across all follow-up tests; under the cross-family judge it is small at every budget. Neither judge has been validated against human labels, so we report this as judge sensitivity, not as evidence that either judge is right.</w:t>
+        <w:t xml:space="preserve"> difference is detected under either judge, though we do not claim equivalence. Because 64% of </w:t>
+      </w:r>
+      <w:r>
+        <w:rPr>
+          <w:smallCaps/>
+        </w:rPr>
+        <w:t>mixed</w:t>
+      </w:r>
+      <w:r>
+        <w:t xml:space="preserve"> answers still reach the 1,024-token limit, this is a sensitivity finding, not a clean estimate of the effect of script. The English advantage over Latin-script code-switching is significant at the topic level only under the self-judge at 1,024 tokens, and not after correction across all follow-up tests; under the cross-family judge it is small at every budget. Neither judge has been validated against human labels, so we report this as judge sensitivity, not as evidence that either judge is right.</w:t>
       </w:r>
     </w:p>
     <w:bookmarkEnd w:id="20"/>
@@ -1262,7 +1271,7 @@
         <w:t>Tokenization.</w:t>
       </w:r>
       <w:r>
-        <w:t xml:space="preserve"> Subword vocabularies fragment low-resource scripts into more tokens [7], [10], with measurable differences in cost and quality across languages [5], [6]. The same premium applies to generated text: an answer in a script that costs more tokens per character fits less content into a fixed output limit, which is the mechanism our budget experiment isolates. Our mediation analysis asks whether the input-side quantity explains the script contrast.</w:t>
+        <w:t xml:space="preserve"> Subword vocabularies fragment low-resource scripts into more tokens [7], [10], with measurable differences in cost and quality across languages [5], [6]. The same premium applies to generated text: an answer in a script that costs more tokens per character fits less content into a fixed output limit, which is the mechanism our budget experiment probes. Our mediation analysis asks whether the input-side quantity explains the script contrast.</w:t>
       </w:r>
     </w:p>
     <w:p>
@@ -6253,7 +6262,7 @@
         <w:t>mixed</w:t>
       </w:r>
       <w:r>
-        <w:t xml:space="preserve"> penalty is not evidence that script alternation harms recall: once the budget allows longer answers, no difference between mixed-script and Latin-script code-switched prompts is detected under either judge, and the intervals exclude a gap of the 128-token size. Its most likely source is that Brahmic-script answers reach the cap before reaching the fact, and answers a human would call incomplete are then graded as wrong; the </w:t>
+        <w:t xml:space="preserve"> penalty is not evidence that script alternation harms recall: once the budget allows longer answers, no difference between mixed-script and Latin-script code-switched prompts is detected under either judge, and the intervals exclude a gap of the 128-token size. The pattern is consistent with Brahmic-script answers reaching the cap before reaching the fact, so that answers a human would call incomplete are graded as wrong; the </w:t>
       </w:r>
       <w:r>
         <w:rPr>
@@ -8763,7 +8772,7 @@
         <w:pStyle w:val="FirstParagraph"/>
       </w:pPr>
       <w:r>
-        <w:t>What the data support is narrower than the design promised, and different from what our first run suggested. Evaluating multilingual LLMs across representation conditions is sensitive to the output-token budget and to the choice of evaluator, and observed differences should not automatically be interpreted as representation effects. For this model and these 20 topics, the clearest representation effect at a 128-token budget, the mixed-script penalty, is no longer detected when answers can be longer, under either judge; the English advantage over code-switching appears or disappears with the judge. We do not claim that native script or code-switching damages factual recall, and we make no claim about other models.</w:t>
+        <w:t>What the data support is narrower than the design promised, and different from what our first run suggested. Evaluating multilingual LLMs across representation conditions is sensitive to the output-token budget and to the choice of evaluator, and observed differences should not automatically be interpreted as representation effects. For this model and these 20 topics, the clearest representation effect at a 128-token budget, the mixed-script penalty, is no longer detected when answers can be longer, under either judge. Since many answers still reach even the largest budget we tested, this shows that the 128-token estimate is sensitive to the budget; it does not provide a clean estimate of the script effect itself; the English advantage over code-switching appears or disappears with the judge. We do not claim that native script or code-switching damages factual recall, and we make no claim about other models.</w:t>
       </w:r>
     </w:p>
     <w:p>
@@ -9317,7 +9326,7 @@
         <w:t>mixed</w:t>
       </w:r>
       <w:r>
-        <w:t xml:space="preserve"> responses still hit the cap, so the budget is not fully removed as a confound; the 1,024-token run was added after the 512-token results were seen and is exploratory; we re-ran three of the six conditions and did not test an instruction fixing the answer language. </w:t>
+        <w:t xml:space="preserve"> responses still hit the cap, so the budget is not fully removed as a confound; the 1,024-token run was added after the 512-token results were seen and is exploratory, and the budget comparison is a sensitivity analysis rather than a clean estimate of the script effect; we re-ran three of the six conditions and did not test an instruction fixing the answer language. </w:t>
       </w:r>
       <w:r>
         <w:rPr>

</xml_diff>